<commit_message>
Update Erros com o capitulo 3
</commit_message>
<xml_diff>
--- a/docs/QA/Documento com os erros.docx
+++ b/docs/QA/Documento com os erros.docx
@@ -38,14 +38,14 @@
           <w:numId w:val="1"/>
         </w:numPr>
         <w:rPr>
-          <w:color w:val="000000" w:themeColor="text1"/>
+          <w:color w:val="auto"/>
           <w:sz w:val="24"/>
           <w:szCs w:val="24"/>
         </w:rPr>
       </w:pPr>
       <w:r>
         <w:rPr>
-          <w:color w:val="000000" w:themeColor="text1"/>
+          <w:color w:val="auto"/>
           <w:sz w:val="24"/>
           <w:szCs w:val="24"/>
         </w:rPr>
@@ -209,7 +209,15 @@
         <w:jc w:val="both"/>
       </w:pPr>
       <w:r>
-        <w:t>Abaixo do campo de “Email“ é preciso ter um campo “Confirmar Email”, assim como abaixo do campo “Senha” é necessário um “Confirmar Senha” para impedir que o usuário digite um Email errado ou senha errada. Essa atualização ajuda o usuário a manter seus dados consistentes na hora do cadastro além de servir como uma segurança em dois fatores.</w:t>
+        <w:t>Abaixo do campo de “</w:t>
+      </w:r>
+      <w:proofErr w:type="gramStart"/>
+      <w:r>
+        <w:t>Email“ é</w:t>
+      </w:r>
+      <w:proofErr w:type="gramEnd"/>
+      <w:r>
+        <w:t xml:space="preserve"> preciso ter um campo “Confirmar Email”, assim como abaixo do campo “Senha” é necessário um “Confirmar Senha” para impedir que o usuário digite um Email errado ou senha errada. Essa atualização ajuda o usuário a manter seus dados consistentes na hora do cadastro além de servir como uma segurança em dois fatores.</w:t>
       </w:r>
     </w:p>
     <w:p>
@@ -309,27 +317,32 @@
       <w:pPr>
         <w:pStyle w:val="Ttulo2"/>
         <w:rPr>
-          <w:color w:val="000000" w:themeColor="text1"/>
+          <w:color w:val="auto"/>
           <w:sz w:val="24"/>
           <w:szCs w:val="24"/>
         </w:rPr>
       </w:pPr>
       <w:r>
-        <w:br w:type="page"/>
-      </w:r>
-    </w:p>
-    <w:p>
-      <w:pPr>
-        <w:pStyle w:val="Ttulo2"/>
-        <w:rPr>
-          <w:color w:val="000000" w:themeColor="text1"/>
+        <w:rPr>
+          <w:color w:val="auto"/>
           <w:sz w:val="24"/>
           <w:szCs w:val="24"/>
         </w:rPr>
-      </w:pPr>
-      <w:r>
-        <w:rPr>
-          <w:color w:val="000000" w:themeColor="text1"/>
+        <w:br w:type="page"/>
+      </w:r>
+    </w:p>
+    <w:p>
+      <w:pPr>
+        <w:pStyle w:val="Ttulo2"/>
+        <w:rPr>
+          <w:color w:val="auto"/>
+          <w:sz w:val="24"/>
+          <w:szCs w:val="24"/>
+        </w:rPr>
+      </w:pPr>
+      <w:r>
+        <w:rPr>
+          <w:color w:val="auto"/>
           <w:sz w:val="24"/>
           <w:szCs w:val="24"/>
         </w:rPr>
@@ -397,19 +410,35 @@
       <w:pPr>
         <w:pStyle w:val="Ttulo2"/>
         <w:rPr>
-          <w:color w:val="000000" w:themeColor="text1"/>
+          <w:color w:val="auto"/>
           <w:sz w:val="24"/>
           <w:szCs w:val="24"/>
         </w:rPr>
       </w:pPr>
       <w:r>
         <w:rPr>
-          <w:color w:val="000000" w:themeColor="text1"/>
+          <w:color w:val="auto"/>
           <w:sz w:val="24"/>
           <w:szCs w:val="24"/>
         </w:rPr>
         <w:lastRenderedPageBreak/>
-        <w:t>1.5 Função “Administrador”  na tela de cadastro</w:t>
+        <w:t>1.5 Função “</w:t>
+      </w:r>
+      <w:r>
+        <w:rPr>
+          <w:color w:val="auto"/>
+          <w:sz w:val="24"/>
+          <w:szCs w:val="24"/>
+        </w:rPr>
+        <w:t>Administrador” na</w:t>
+      </w:r>
+      <w:r>
+        <w:rPr>
+          <w:color w:val="auto"/>
+          <w:sz w:val="24"/>
+          <w:szCs w:val="24"/>
+        </w:rPr>
+        <w:t xml:space="preserve"> tela de cadastro</w:t>
       </w:r>
     </w:p>
     <w:p>
@@ -494,7 +523,15 @@
         <w:jc w:val="both"/>
       </w:pPr>
       <w:r>
-        <w:t>É melhor que a opção de criar usuários do tipo “Administrador” sejam criados na tela de “Usuários” e aqui no login as únicas funções disponíveis sejam Visitante, Aluno, Professor, esse tipo de cargo.</w:t>
+        <w:t xml:space="preserve">É melhor que a opção de criar usuários do tipo “Administrador” sejam criados na tela de “Usuários” e aqui no login as únicas funções disponíveis sejam </w:t>
+      </w:r>
+      <w:proofErr w:type="gramStart"/>
+      <w:r>
+        <w:t>Visitante</w:t>
+      </w:r>
+      <w:proofErr w:type="gramEnd"/>
+      <w:r>
+        <w:t>, Aluno, Professor, esse tipo de cargo.</w:t>
       </w:r>
     </w:p>
     <w:p>
@@ -793,6 +830,9 @@
         <w:jc w:val="center"/>
       </w:pPr>
       <w:r>
+        <w:rPr>
+          <w:noProof/>
+        </w:rPr>
         <w:drawing>
           <wp:inline distT="0" distB="0" distL="0" distR="0" wp14:anchorId="0055C36A" wp14:editId="44F23C4B">
             <wp:extent cx="5400040" cy="2416810"/>
@@ -854,23 +894,42 @@
       <w:pPr>
         <w:pStyle w:val="Ttulo2"/>
         <w:rPr>
-          <w:color w:val="000000" w:themeColor="text1"/>
+          <w:color w:val="auto"/>
           <w:sz w:val="24"/>
           <w:szCs w:val="24"/>
         </w:rPr>
       </w:pPr>
       <w:r>
         <w:rPr>
-          <w:color w:val="000000" w:themeColor="text1"/>
+          <w:color w:val="auto"/>
           <w:sz w:val="24"/>
           <w:szCs w:val="24"/>
         </w:rPr>
         <w:lastRenderedPageBreak/>
-        <w:t>2.2 O carrossel de notícias não redirecionam o usuário</w:t>
-      </w:r>
-    </w:p>
-    <w:p>
-      <w:r>
+        <w:t xml:space="preserve">2.2 </w:t>
+      </w:r>
+      <w:r>
+        <w:rPr>
+          <w:color w:val="auto"/>
+          <w:sz w:val="24"/>
+          <w:szCs w:val="24"/>
+        </w:rPr>
+        <w:t>O carrossel de notícias não redireciona</w:t>
+      </w:r>
+      <w:r>
+        <w:rPr>
+          <w:color w:val="auto"/>
+          <w:sz w:val="24"/>
+          <w:szCs w:val="24"/>
+        </w:rPr>
+        <w:t xml:space="preserve"> o usuário</w:t>
+      </w:r>
+    </w:p>
+    <w:p>
+      <w:r>
+        <w:rPr>
+          <w:noProof/>
+        </w:rPr>
         <w:drawing>
           <wp:inline distT="0" distB="0" distL="0" distR="0" wp14:anchorId="4388D7A8" wp14:editId="1B271291">
             <wp:extent cx="5400040" cy="1672590"/>
@@ -923,14 +982,14 @@
       <w:pPr>
         <w:pStyle w:val="Ttulo2"/>
         <w:rPr>
-          <w:color w:val="000000" w:themeColor="text1"/>
+          <w:color w:val="auto"/>
           <w:sz w:val="24"/>
           <w:szCs w:val="24"/>
         </w:rPr>
       </w:pPr>
       <w:r>
         <w:rPr>
-          <w:color w:val="000000" w:themeColor="text1"/>
+          <w:color w:val="auto"/>
           <w:sz w:val="24"/>
           <w:szCs w:val="24"/>
         </w:rPr>
@@ -943,6 +1002,9 @@
         <w:jc w:val="both"/>
       </w:pPr>
       <w:r>
+        <w:rPr>
+          <w:noProof/>
+        </w:rPr>
         <w:drawing>
           <wp:inline distT="0" distB="0" distL="0" distR="0" wp14:anchorId="4A742B14" wp14:editId="61010529">
             <wp:extent cx="5400040" cy="1672590"/>
@@ -997,14 +1059,14 @@
       <w:pPr>
         <w:pStyle w:val="Ttulo2"/>
         <w:rPr>
-          <w:color w:val="000000" w:themeColor="text1"/>
+          <w:color w:val="auto"/>
           <w:sz w:val="24"/>
           <w:szCs w:val="24"/>
         </w:rPr>
       </w:pPr>
       <w:r>
         <w:rPr>
-          <w:color w:val="000000" w:themeColor="text1"/>
+          <w:color w:val="auto"/>
           <w:sz w:val="24"/>
           <w:szCs w:val="24"/>
         </w:rPr>
@@ -1022,6 +1084,9 @@
         <w:jc w:val="both"/>
       </w:pPr>
       <w:r>
+        <w:rPr>
+          <w:noProof/>
+        </w:rPr>
         <w:drawing>
           <wp:inline distT="0" distB="0" distL="0" distR="0" wp14:anchorId="65B35A3B" wp14:editId="78F37B9F">
             <wp:extent cx="5400040" cy="2005965"/>
@@ -1081,14 +1146,14 @@
       <w:pPr>
         <w:pStyle w:val="Ttulo2"/>
         <w:rPr>
-          <w:color w:val="000000" w:themeColor="text1"/>
+          <w:color w:val="auto"/>
           <w:sz w:val="24"/>
           <w:szCs w:val="24"/>
         </w:rPr>
       </w:pPr>
       <w:r>
         <w:rPr>
-          <w:color w:val="000000" w:themeColor="text1"/>
+          <w:color w:val="auto"/>
           <w:sz w:val="24"/>
           <w:szCs w:val="24"/>
         </w:rPr>
@@ -1106,6 +1171,9 @@
         <w:jc w:val="both"/>
       </w:pPr>
       <w:r>
+        <w:rPr>
+          <w:noProof/>
+        </w:rPr>
         <w:drawing>
           <wp:inline distT="0" distB="0" distL="0" distR="0" wp14:anchorId="5609F942" wp14:editId="0E344A08">
             <wp:extent cx="5400040" cy="2416810"/>
@@ -1170,16 +1238,646 @@
       </w:r>
     </w:p>
     <w:p>
+      <w:pPr>
+        <w:jc w:val="center"/>
+      </w:pPr>
       <w:r>
         <w:br w:type="page"/>
       </w:r>
     </w:p>
+    <w:p>
+      <w:pPr>
+        <w:pStyle w:val="Ttulo2"/>
+        <w:rPr>
+          <w:color w:val="auto"/>
+          <w:sz w:val="24"/>
+          <w:szCs w:val="24"/>
+        </w:rPr>
+      </w:pPr>
+      <w:r>
+        <w:rPr>
+          <w:color w:val="auto"/>
+          <w:sz w:val="24"/>
+          <w:szCs w:val="24"/>
+        </w:rPr>
+        <w:lastRenderedPageBreak/>
+        <w:t>2.6 Links dos cards</w:t>
+      </w:r>
+    </w:p>
+    <w:p/>
+    <w:p>
+      <w:r>
+        <w:drawing>
+          <wp:inline distT="0" distB="0" distL="0" distR="0" wp14:anchorId="4CAA2D65" wp14:editId="0624F614">
+            <wp:extent cx="3524742" cy="981212"/>
+            <wp:effectExtent l="0" t="0" r="0" b="9525"/>
+            <wp:docPr id="534614218" name="Imagem 1" descr="Interface gráfica do usuário, Texto, Aplicativo&#10;&#10;O conteúdo gerado por IA pode estar incorreto."/>
+            <wp:cNvGraphicFramePr>
+              <a:graphicFrameLocks xmlns:a="http://schemas.openxmlformats.org/drawingml/2006/main" noChangeAspect="1"/>
+            </wp:cNvGraphicFramePr>
+            <a:graphic xmlns:a="http://schemas.openxmlformats.org/drawingml/2006/main">
+              <a:graphicData uri="http://schemas.openxmlformats.org/drawingml/2006/picture">
+                <pic:pic xmlns:pic="http://schemas.openxmlformats.org/drawingml/2006/picture">
+                  <pic:nvPicPr>
+                    <pic:cNvPr id="534614218" name="Imagem 1" descr="Interface gráfica do usuário, Texto, Aplicativo&#10;&#10;O conteúdo gerado por IA pode estar incorreto."/>
+                    <pic:cNvPicPr/>
+                  </pic:nvPicPr>
+                  <pic:blipFill>
+                    <a:blip r:embed="rId17"/>
+                    <a:stretch>
+                      <a:fillRect/>
+                    </a:stretch>
+                  </pic:blipFill>
+                  <pic:spPr>
+                    <a:xfrm>
+                      <a:off x="0" y="0"/>
+                      <a:ext cx="3524742" cy="981212"/>
+                    </a:xfrm>
+                    <a:prstGeom prst="rect">
+                      <a:avLst/>
+                    </a:prstGeom>
+                  </pic:spPr>
+                </pic:pic>
+              </a:graphicData>
+            </a:graphic>
+          </wp:inline>
+        </w:drawing>
+      </w:r>
+    </w:p>
+    <w:p/>
     <w:p>
       <w:pPr>
         <w:tabs>
           <w:tab w:val="left" w:pos="2055"/>
         </w:tabs>
       </w:pPr>
+      <w:r>
+        <w:drawing>
+          <wp:inline distT="0" distB="0" distL="0" distR="0" wp14:anchorId="52F85D08" wp14:editId="6C8A3177">
+            <wp:extent cx="3486637" cy="1095528"/>
+            <wp:effectExtent l="0" t="0" r="0" b="9525"/>
+            <wp:docPr id="1125623291" name="Imagem 1" descr="Interface gráfica do usuário, Texto&#10;&#10;O conteúdo gerado por IA pode estar incorreto."/>
+            <wp:cNvGraphicFramePr>
+              <a:graphicFrameLocks xmlns:a="http://schemas.openxmlformats.org/drawingml/2006/main" noChangeAspect="1"/>
+            </wp:cNvGraphicFramePr>
+            <a:graphic xmlns:a="http://schemas.openxmlformats.org/drawingml/2006/main">
+              <a:graphicData uri="http://schemas.openxmlformats.org/drawingml/2006/picture">
+                <pic:pic xmlns:pic="http://schemas.openxmlformats.org/drawingml/2006/picture">
+                  <pic:nvPicPr>
+                    <pic:cNvPr id="1125623291" name="Imagem 1" descr="Interface gráfica do usuário, Texto&#10;&#10;O conteúdo gerado por IA pode estar incorreto."/>
+                    <pic:cNvPicPr/>
+                  </pic:nvPicPr>
+                  <pic:blipFill>
+                    <a:blip r:embed="rId18"/>
+                    <a:stretch>
+                      <a:fillRect/>
+                    </a:stretch>
+                  </pic:blipFill>
+                  <pic:spPr>
+                    <a:xfrm>
+                      <a:off x="0" y="0"/>
+                      <a:ext cx="3486637" cy="1095528"/>
+                    </a:xfrm>
+                    <a:prstGeom prst="rect">
+                      <a:avLst/>
+                    </a:prstGeom>
+                  </pic:spPr>
+                </pic:pic>
+              </a:graphicData>
+            </a:graphic>
+          </wp:inline>
+        </w:drawing>
+      </w:r>
+    </w:p>
+    <w:p>
+      <w:pPr>
+        <w:tabs>
+          <w:tab w:val="left" w:pos="2055"/>
+        </w:tabs>
+      </w:pPr>
+      <w:r>
+        <w:drawing>
+          <wp:anchor distT="0" distB="0" distL="114300" distR="114300" simplePos="0" relativeHeight="251659264" behindDoc="0" locked="0" layoutInCell="1" allowOverlap="1" wp14:anchorId="587F8DA5" wp14:editId="02183B8C">
+            <wp:simplePos x="1076325" y="4162425"/>
+            <wp:positionH relativeFrom="column">
+              <wp:align>left</wp:align>
+            </wp:positionH>
+            <wp:positionV relativeFrom="paragraph">
+              <wp:align>top</wp:align>
+            </wp:positionV>
+            <wp:extent cx="3343742" cy="943107"/>
+            <wp:effectExtent l="0" t="0" r="0" b="9525"/>
+            <wp:wrapSquare wrapText="bothSides"/>
+            <wp:docPr id="913997650" name="Imagem 1" descr="Interface gráfica do usuário, Aplicativo&#10;&#10;O conteúdo gerado por IA pode estar incorreto."/>
+            <wp:cNvGraphicFramePr>
+              <a:graphicFrameLocks xmlns:a="http://schemas.openxmlformats.org/drawingml/2006/main" noChangeAspect="1"/>
+            </wp:cNvGraphicFramePr>
+            <a:graphic xmlns:a="http://schemas.openxmlformats.org/drawingml/2006/main">
+              <a:graphicData uri="http://schemas.openxmlformats.org/drawingml/2006/picture">
+                <pic:pic xmlns:pic="http://schemas.openxmlformats.org/drawingml/2006/picture">
+                  <pic:nvPicPr>
+                    <pic:cNvPr id="913997650" name="Imagem 1" descr="Interface gráfica do usuário, Aplicativo&#10;&#10;O conteúdo gerado por IA pode estar incorreto."/>
+                    <pic:cNvPicPr/>
+                  </pic:nvPicPr>
+                  <pic:blipFill>
+                    <a:blip r:embed="rId19">
+                      <a:extLst>
+                        <a:ext uri="{28A0092B-C50C-407E-A947-70E740481C1C}">
+                          <a14:useLocalDpi xmlns:a14="http://schemas.microsoft.com/office/drawing/2010/main" val="0"/>
+                        </a:ext>
+                      </a:extLst>
+                    </a:blip>
+                    <a:stretch>
+                      <a:fillRect/>
+                    </a:stretch>
+                  </pic:blipFill>
+                  <pic:spPr>
+                    <a:xfrm>
+                      <a:off x="0" y="0"/>
+                      <a:ext cx="3343742" cy="943107"/>
+                    </a:xfrm>
+                    <a:prstGeom prst="rect">
+                      <a:avLst/>
+                    </a:prstGeom>
+                  </pic:spPr>
+                </pic:pic>
+              </a:graphicData>
+            </a:graphic>
+          </wp:anchor>
+        </w:drawing>
+      </w:r>
+    </w:p>
+    <w:p>
+      <w:pPr>
+        <w:tabs>
+          <w:tab w:val="left" w:pos="2055"/>
+        </w:tabs>
+      </w:pPr>
+      <w:r>
+        <w:br w:type="textWrapping" w:clear="all"/>
+      </w:r>
+    </w:p>
+    <w:p>
+      <w:pPr>
+        <w:tabs>
+          <w:tab w:val="left" w:pos="2055"/>
+        </w:tabs>
+      </w:pPr>
+      <w:r>
+        <w:t>Os cards “Sobre o SENAI Mariano Ferraz”, “Horário das Aulas” e “Biblioteca” não redirecionam o usuário até suas respectivas páginas. Está faltando o link nelas.</w:t>
+      </w:r>
+    </w:p>
+    <w:p>
+      <w:r>
+        <w:br w:type="page"/>
+      </w:r>
+    </w:p>
+    <w:p>
+      <w:pPr>
+        <w:pStyle w:val="Ttulo2"/>
+        <w:rPr>
+          <w:color w:val="auto"/>
+          <w:sz w:val="24"/>
+          <w:szCs w:val="24"/>
+        </w:rPr>
+      </w:pPr>
+      <w:r>
+        <w:rPr>
+          <w:color w:val="auto"/>
+          <w:sz w:val="24"/>
+          <w:szCs w:val="24"/>
+        </w:rPr>
+        <w:lastRenderedPageBreak/>
+        <w:t>2.7 Mensagem de erro</w:t>
+      </w:r>
+    </w:p>
+    <w:p/>
+    <w:p>
+      <w:r>
+        <w:drawing>
+          <wp:anchor distT="0" distB="0" distL="114300" distR="114300" simplePos="0" relativeHeight="251661312" behindDoc="0" locked="0" layoutInCell="1" allowOverlap="1" wp14:anchorId="3FD54EA5" wp14:editId="7536DEEA">
+            <wp:simplePos x="1076325" y="4162425"/>
+            <wp:positionH relativeFrom="column">
+              <wp:align>left</wp:align>
+            </wp:positionH>
+            <wp:positionV relativeFrom="paragraph">
+              <wp:align>top</wp:align>
+            </wp:positionV>
+            <wp:extent cx="3343742" cy="943107"/>
+            <wp:effectExtent l="0" t="0" r="0" b="9525"/>
+            <wp:wrapSquare wrapText="bothSides"/>
+            <wp:docPr id="540254833" name="Imagem 1" descr="Interface gráfica do usuário, Aplicativo&#10;&#10;O conteúdo gerado por IA pode estar incorreto."/>
+            <wp:cNvGraphicFramePr>
+              <a:graphicFrameLocks xmlns:a="http://schemas.openxmlformats.org/drawingml/2006/main" noChangeAspect="1"/>
+            </wp:cNvGraphicFramePr>
+            <a:graphic xmlns:a="http://schemas.openxmlformats.org/drawingml/2006/main">
+              <a:graphicData uri="http://schemas.openxmlformats.org/drawingml/2006/picture">
+                <pic:pic xmlns:pic="http://schemas.openxmlformats.org/drawingml/2006/picture">
+                  <pic:nvPicPr>
+                    <pic:cNvPr id="913997650" name="Imagem 1" descr="Interface gráfica do usuário, Aplicativo&#10;&#10;O conteúdo gerado por IA pode estar incorreto."/>
+                    <pic:cNvPicPr/>
+                  </pic:nvPicPr>
+                  <pic:blipFill>
+                    <a:blip r:embed="rId19">
+                      <a:extLst>
+                        <a:ext uri="{28A0092B-C50C-407E-A947-70E740481C1C}">
+                          <a14:useLocalDpi xmlns:a14="http://schemas.microsoft.com/office/drawing/2010/main" val="0"/>
+                        </a:ext>
+                      </a:extLst>
+                    </a:blip>
+                    <a:stretch>
+                      <a:fillRect/>
+                    </a:stretch>
+                  </pic:blipFill>
+                  <pic:spPr>
+                    <a:xfrm>
+                      <a:off x="0" y="0"/>
+                      <a:ext cx="3343742" cy="943107"/>
+                    </a:xfrm>
+                    <a:prstGeom prst="rect">
+                      <a:avLst/>
+                    </a:prstGeom>
+                  </pic:spPr>
+                </pic:pic>
+              </a:graphicData>
+            </a:graphic>
+          </wp:anchor>
+        </w:drawing>
+      </w:r>
+    </w:p>
+    <w:p>
+      <w:pPr>
+        <w:tabs>
+          <w:tab w:val="left" w:pos="2055"/>
+        </w:tabs>
+      </w:pPr>
+    </w:p>
+    <w:p>
+      <w:pPr>
+        <w:tabs>
+          <w:tab w:val="left" w:pos="2055"/>
+        </w:tabs>
+      </w:pPr>
+    </w:p>
+    <w:p>
+      <w:pPr>
+        <w:tabs>
+          <w:tab w:val="left" w:pos="2055"/>
+        </w:tabs>
+      </w:pPr>
+    </w:p>
+    <w:p>
+      <w:pPr>
+        <w:tabs>
+          <w:tab w:val="left" w:pos="2055"/>
+        </w:tabs>
+        <w:jc w:val="both"/>
+      </w:pPr>
+    </w:p>
+    <w:p>
+      <w:pPr>
+        <w:tabs>
+          <w:tab w:val="left" w:pos="2055"/>
+        </w:tabs>
+        <w:jc w:val="both"/>
+      </w:pPr>
+      <w:r>
+        <w:t>A mensagem de erro padrão manda o usuário para a página de login, isso funciona bem quando o usuário está na página de “Cadastro”, “Login” ou de “Esqueci Senha”, porém como já estou logado no sistema não faz sentido ter que voltar para a página de “Login”, o mais correto seria retornar para a “Homepage”.</w:t>
+      </w:r>
+    </w:p>
+    <w:p>
+      <w:r>
+        <w:br w:type="page"/>
+      </w:r>
+    </w:p>
+    <w:p>
+      <w:pPr>
+        <w:pStyle w:val="Ttulo1"/>
+        <w:rPr>
+          <w:color w:val="auto"/>
+          <w:sz w:val="24"/>
+          <w:szCs w:val="24"/>
+        </w:rPr>
+      </w:pPr>
+      <w:r>
+        <w:rPr>
+          <w:color w:val="auto"/>
+          <w:sz w:val="24"/>
+          <w:szCs w:val="24"/>
+        </w:rPr>
+        <w:lastRenderedPageBreak/>
+        <w:t xml:space="preserve">3. Sobre o SENAI  </w:t>
+      </w:r>
+    </w:p>
+    <w:p>
+      <w:pPr>
+        <w:pStyle w:val="Ttulo2"/>
+        <w:rPr>
+          <w:color w:val="auto"/>
+          <w:sz w:val="24"/>
+          <w:szCs w:val="24"/>
+        </w:rPr>
+      </w:pPr>
+      <w:r>
+        <w:rPr>
+          <w:color w:val="auto"/>
+          <w:sz w:val="24"/>
+          <w:szCs w:val="24"/>
+        </w:rPr>
+        <w:t>3.1 Faltam os dados de verdade</w:t>
+      </w:r>
+    </w:p>
+    <w:p>
+      <w:r>
+        <w:drawing>
+          <wp:inline distT="0" distB="0" distL="0" distR="0" wp14:anchorId="2C893E22" wp14:editId="38426E59">
+            <wp:extent cx="5400040" cy="5002530"/>
+            <wp:effectExtent l="0" t="0" r="0" b="7620"/>
+            <wp:docPr id="995180519" name="Imagem 1" descr="Tela de celular com publicação numa rede social&#10;&#10;O conteúdo gerado por IA pode estar incorreto."/>
+            <wp:cNvGraphicFramePr>
+              <a:graphicFrameLocks xmlns:a="http://schemas.openxmlformats.org/drawingml/2006/main" noChangeAspect="1"/>
+            </wp:cNvGraphicFramePr>
+            <a:graphic xmlns:a="http://schemas.openxmlformats.org/drawingml/2006/main">
+              <a:graphicData uri="http://schemas.openxmlformats.org/drawingml/2006/picture">
+                <pic:pic xmlns:pic="http://schemas.openxmlformats.org/drawingml/2006/picture">
+                  <pic:nvPicPr>
+                    <pic:cNvPr id="995180519" name="Imagem 1" descr="Tela de celular com publicação numa rede social&#10;&#10;O conteúdo gerado por IA pode estar incorreto."/>
+                    <pic:cNvPicPr/>
+                  </pic:nvPicPr>
+                  <pic:blipFill>
+                    <a:blip r:embed="rId20"/>
+                    <a:stretch>
+                      <a:fillRect/>
+                    </a:stretch>
+                  </pic:blipFill>
+                  <pic:spPr>
+                    <a:xfrm>
+                      <a:off x="0" y="0"/>
+                      <a:ext cx="5400040" cy="5002530"/>
+                    </a:xfrm>
+                    <a:prstGeom prst="rect">
+                      <a:avLst/>
+                    </a:prstGeom>
+                  </pic:spPr>
+                </pic:pic>
+              </a:graphicData>
+            </a:graphic>
+          </wp:inline>
+        </w:drawing>
+      </w:r>
+    </w:p>
+    <w:p>
+      <w:r>
+        <w:t>Ainda faltam os dados e imagens de verdade sobre o SENAI e sua história.</w:t>
+      </w:r>
+    </w:p>
+    <w:p>
+      <w:r>
+        <w:br w:type="page"/>
+      </w:r>
+    </w:p>
+    <w:p>
+      <w:pPr>
+        <w:pStyle w:val="Ttulo2"/>
+        <w:jc w:val="both"/>
+        <w:rPr>
+          <w:color w:val="auto"/>
+          <w:sz w:val="24"/>
+          <w:szCs w:val="24"/>
+        </w:rPr>
+      </w:pPr>
+      <w:r>
+        <w:rPr>
+          <w:color w:val="auto"/>
+          <w:sz w:val="24"/>
+          <w:szCs w:val="24"/>
+        </w:rPr>
+        <w:lastRenderedPageBreak/>
+        <w:t xml:space="preserve">3.2 Título </w:t>
+      </w:r>
+    </w:p>
+    <w:p>
+      <w:pPr>
+        <w:jc w:val="both"/>
+      </w:pPr>
+      <w:r>
+        <w:drawing>
+          <wp:anchor distT="0" distB="0" distL="114300" distR="114300" simplePos="0" relativeHeight="251662336" behindDoc="0" locked="0" layoutInCell="1" allowOverlap="1" wp14:anchorId="605B5CF2" wp14:editId="6ECF646F">
+            <wp:simplePos x="0" y="0"/>
+            <wp:positionH relativeFrom="margin">
+              <wp:align>center</wp:align>
+            </wp:positionH>
+            <wp:positionV relativeFrom="paragraph">
+              <wp:posOffset>107950</wp:posOffset>
+            </wp:positionV>
+            <wp:extent cx="3496163" cy="628738"/>
+            <wp:effectExtent l="0" t="0" r="0" b="0"/>
+            <wp:wrapSquare wrapText="bothSides"/>
+            <wp:docPr id="781706930" name="Imagem 1" descr="Logotipo, nome da empresa&#10;&#10;O conteúdo gerado por IA pode estar incorreto."/>
+            <wp:cNvGraphicFramePr>
+              <a:graphicFrameLocks xmlns:a="http://schemas.openxmlformats.org/drawingml/2006/main" noChangeAspect="1"/>
+            </wp:cNvGraphicFramePr>
+            <a:graphic xmlns:a="http://schemas.openxmlformats.org/drawingml/2006/main">
+              <a:graphicData uri="http://schemas.openxmlformats.org/drawingml/2006/picture">
+                <pic:pic xmlns:pic="http://schemas.openxmlformats.org/drawingml/2006/picture">
+                  <pic:nvPicPr>
+                    <pic:cNvPr id="781706930" name="Imagem 1" descr="Logotipo, nome da empresa&#10;&#10;O conteúdo gerado por IA pode estar incorreto."/>
+                    <pic:cNvPicPr/>
+                  </pic:nvPicPr>
+                  <pic:blipFill>
+                    <a:blip r:embed="rId21">
+                      <a:extLst>
+                        <a:ext uri="{28A0092B-C50C-407E-A947-70E740481C1C}">
+                          <a14:useLocalDpi xmlns:a14="http://schemas.microsoft.com/office/drawing/2010/main" val="0"/>
+                        </a:ext>
+                      </a:extLst>
+                    </a:blip>
+                    <a:stretch>
+                      <a:fillRect/>
+                    </a:stretch>
+                  </pic:blipFill>
+                  <pic:spPr>
+                    <a:xfrm>
+                      <a:off x="0" y="0"/>
+                      <a:ext cx="3496163" cy="628738"/>
+                    </a:xfrm>
+                    <a:prstGeom prst="rect">
+                      <a:avLst/>
+                    </a:prstGeom>
+                  </pic:spPr>
+                </pic:pic>
+              </a:graphicData>
+            </a:graphic>
+          </wp:anchor>
+        </w:drawing>
+      </w:r>
+    </w:p>
+    <w:p>
+      <w:pPr>
+        <w:jc w:val="both"/>
+      </w:pPr>
+    </w:p>
+    <w:p>
+      <w:pPr>
+        <w:jc w:val="both"/>
+      </w:pPr>
+      <w:r>
+        <w:br w:type="textWrapping" w:clear="all"/>
+        <w:t>Apesar de ser a página “Sobre o SENAI” o título é “Sobre o SENAI Mariano Ferraz”, o que claramente é o nome da outra página “Sobre o SENAI Mariano Ferraz”, ou seja, deve-se mudar o título para algo como “O SENAI” ou “Sobre o SENAI”.</w:t>
+      </w:r>
+    </w:p>
+    <w:p>
+      <w:r>
+        <w:br w:type="page"/>
+      </w:r>
+    </w:p>
+    <w:p>
+      <w:pPr>
+        <w:pStyle w:val="Ttulo2"/>
+        <w:rPr>
+          <w:color w:val="auto"/>
+          <w:sz w:val="24"/>
+          <w:szCs w:val="24"/>
+        </w:rPr>
+      </w:pPr>
+      <w:r>
+        <w:rPr>
+          <w:color w:val="auto"/>
+          <w:sz w:val="24"/>
+          <w:szCs w:val="24"/>
+        </w:rPr>
+        <w:lastRenderedPageBreak/>
+        <w:t>3.3 Espaço na barra de navegação</w:t>
+      </w:r>
+    </w:p>
+    <w:p>
+      <w:pPr>
+        <w:jc w:val="center"/>
+      </w:pPr>
+      <w:r>
+        <w:drawing>
+          <wp:inline distT="0" distB="0" distL="0" distR="0" wp14:anchorId="467C8172" wp14:editId="67749689">
+            <wp:extent cx="2753109" cy="2495898"/>
+            <wp:effectExtent l="0" t="0" r="9525" b="0"/>
+            <wp:docPr id="674421614" name="Imagem 1" descr="Uma imagem contendo Gráfico&#10;&#10;O conteúdo gerado por IA pode estar incorreto."/>
+            <wp:cNvGraphicFramePr>
+              <a:graphicFrameLocks xmlns:a="http://schemas.openxmlformats.org/drawingml/2006/main" noChangeAspect="1"/>
+            </wp:cNvGraphicFramePr>
+            <a:graphic xmlns:a="http://schemas.openxmlformats.org/drawingml/2006/main">
+              <a:graphicData uri="http://schemas.openxmlformats.org/drawingml/2006/picture">
+                <pic:pic xmlns:pic="http://schemas.openxmlformats.org/drawingml/2006/picture">
+                  <pic:nvPicPr>
+                    <pic:cNvPr id="674421614" name="Imagem 1" descr="Uma imagem contendo Gráfico&#10;&#10;O conteúdo gerado por IA pode estar incorreto."/>
+                    <pic:cNvPicPr/>
+                  </pic:nvPicPr>
+                  <pic:blipFill>
+                    <a:blip r:embed="rId22"/>
+                    <a:stretch>
+                      <a:fillRect/>
+                    </a:stretch>
+                  </pic:blipFill>
+                  <pic:spPr>
+                    <a:xfrm>
+                      <a:off x="0" y="0"/>
+                      <a:ext cx="2753109" cy="2495898"/>
+                    </a:xfrm>
+                    <a:prstGeom prst="rect">
+                      <a:avLst/>
+                    </a:prstGeom>
+                  </pic:spPr>
+                </pic:pic>
+              </a:graphicData>
+            </a:graphic>
+          </wp:inline>
+        </w:drawing>
+      </w:r>
+    </w:p>
+    <w:p>
+      <w:pPr>
+        <w:jc w:val="both"/>
+      </w:pPr>
+      <w:r>
+        <w:t>Tem um espaço em branco entre o topo da barra de navegação e a barra de navegação. E esse espaço também se move quando abaixamos e subimos a página através do scroll do mouse.</w:t>
+      </w:r>
+    </w:p>
+    <w:p>
+      <w:r>
+        <w:br w:type="page"/>
+      </w:r>
+    </w:p>
+    <w:p>
+      <w:pPr>
+        <w:pStyle w:val="Ttulo2"/>
+        <w:rPr>
+          <w:color w:val="auto"/>
+          <w:sz w:val="24"/>
+          <w:szCs w:val="24"/>
+        </w:rPr>
+      </w:pPr>
+      <w:r>
+        <w:rPr>
+          <w:color w:val="auto"/>
+          <w:sz w:val="24"/>
+          <w:szCs w:val="24"/>
+        </w:rPr>
+        <w:lastRenderedPageBreak/>
+        <w:t>3.4 Opções da barra de navegação</w:t>
+      </w:r>
+    </w:p>
+    <w:p>
+      <w:pPr>
+        <w:jc w:val="both"/>
+      </w:pPr>
+    </w:p>
+    <w:p>
+      <w:pPr>
+        <w:jc w:val="center"/>
+      </w:pPr>
+      <w:r>
+        <w:drawing>
+          <wp:inline distT="0" distB="0" distL="0" distR="0" wp14:anchorId="1D6F993D" wp14:editId="71D6AF99">
+            <wp:extent cx="2753109" cy="2495898"/>
+            <wp:effectExtent l="0" t="0" r="9525" b="0"/>
+            <wp:docPr id="905751622" name="Imagem 1" descr="Uma imagem contendo Gráfico&#10;&#10;O conteúdo gerado por IA pode estar incorreto."/>
+            <wp:cNvGraphicFramePr>
+              <a:graphicFrameLocks xmlns:a="http://schemas.openxmlformats.org/drawingml/2006/main" noChangeAspect="1"/>
+            </wp:cNvGraphicFramePr>
+            <a:graphic xmlns:a="http://schemas.openxmlformats.org/drawingml/2006/main">
+              <a:graphicData uri="http://schemas.openxmlformats.org/drawingml/2006/picture">
+                <pic:pic xmlns:pic="http://schemas.openxmlformats.org/drawingml/2006/picture">
+                  <pic:nvPicPr>
+                    <pic:cNvPr id="905751622" name="Imagem 1" descr="Uma imagem contendo Gráfico&#10;&#10;O conteúdo gerado por IA pode estar incorreto."/>
+                    <pic:cNvPicPr/>
+                  </pic:nvPicPr>
+                  <pic:blipFill>
+                    <a:blip r:embed="rId22"/>
+                    <a:stretch>
+                      <a:fillRect/>
+                    </a:stretch>
+                  </pic:blipFill>
+                  <pic:spPr>
+                    <a:xfrm>
+                      <a:off x="0" y="0"/>
+                      <a:ext cx="2753109" cy="2495898"/>
+                    </a:xfrm>
+                    <a:prstGeom prst="rect">
+                      <a:avLst/>
+                    </a:prstGeom>
+                  </pic:spPr>
+                </pic:pic>
+              </a:graphicData>
+            </a:graphic>
+          </wp:inline>
+        </w:drawing>
+      </w:r>
+    </w:p>
+    <w:p>
+      <w:pPr>
+        <w:jc w:val="both"/>
+      </w:pPr>
+      <w:r>
+        <w:t>A barra de navegação não contém todas as páginas disponíveis do sistema. Ainda faltam as páginas “Sobre o SENAI Mariano Ferraz”, “Vagas de Estágio”, “Biblioteca”, “Cursos”, “Mapa da Escola”.</w:t>
+      </w:r>
     </w:p>
     <w:sectPr>
       <w:pgSz w:w="11906" w:h="16838"/>
@@ -1244,6 +1942,119 @@
 <file path=word/numbering.xml><?xml version="1.0" encoding="utf-8"?>
 <w:numbering xmlns:wpc="http://schemas.microsoft.com/office/word/2010/wordprocessingCanvas" xmlns:cx="http://schemas.microsoft.com/office/drawing/2014/chartex" xmlns:cx1="http://schemas.microsoft.com/office/drawing/2015/9/8/chartex" xmlns:cx2="http://schemas.microsoft.com/office/drawing/2015/10/21/chartex" xmlns:cx3="http://schemas.microsoft.com/office/drawing/2016/5/9/chartex" xmlns:cx4="http://schemas.microsoft.com/office/drawing/2016/5/10/chartex" xmlns:cx5="http://schemas.microsoft.com/office/drawing/2016/5/11/chartex" xmlns:cx6="http://schemas.microsoft.com/office/drawing/2016/5/12/chartex" xmlns:cx7="http://schemas.microsoft.com/office/drawing/2016/5/13/chartex" xmlns:cx8="http://schemas.microsoft.com/office/drawing/2016/5/14/chartex" xmlns:mc="http://schemas.openxmlformats.org/markup-compatibility/2006" xmlns:aink="http://schemas.microsoft.com/office/drawing/2016/ink" xmlns:am3d="http://schemas.microsoft.com/office/drawing/2017/model3d" xmlns:o="urn:schemas-microsoft-com:office:office" xmlns:oel="http://schemas.microsoft.com/office/2019/extlst" xmlns:r="http://schemas.openxmlformats.org/officeDocument/2006/relationships" xmlns:m="http://schemas.openxmlformats.org/officeDocument/2006/math" xmlns:v="urn:schemas-microsoft-com:vml" xmlns:wp14="http://schemas.microsoft.com/office/word/2010/wordprocessingDrawing" xmlns:wp="http://schemas.openxmlformats.org/drawingml/2006/wordprocessingDrawing" xmlns:w10="urn:schemas-microsoft-com:office:word" xmlns:w="http://schemas.openxmlformats.org/wordprocessingml/2006/main" xmlns:w14="http://schemas.microsoft.com/office/word/2010/wordml" xmlns:w15="http://schemas.microsoft.com/office/word/2012/wordml" xmlns:w16cex="http://schemas.microsoft.com/office/word/2018/wordml/cex" xmlns:w16cid="http://schemas.microsoft.com/office/word/2016/wordml/cid" xmlns:w16="http://schemas.microsoft.com/office/word/2018/wordml" xmlns:w16du="http://schemas.microsoft.com/office/word/2023/wordml/word16du" xmlns:w16sdtdh="http://schemas.microsoft.com/office/word/2020/wordml/sdtdatahash" xmlns:w16sdtfl="http://schemas.microsoft.com/office/word/2024/wordml/sdtformatlock" xmlns:w16se="http://schemas.microsoft.com/office/word/2015/wordml/symex" xmlns:wpg="http://schemas.microsoft.com/office/word/2010/wordprocessingGroup" xmlns:wpi="http://schemas.microsoft.com/office/word/2010/wordprocessingInk" xmlns:wne="http://schemas.microsoft.com/office/word/2006/wordml" xmlns:wps="http://schemas.microsoft.com/office/word/2010/wordprocessingShape" mc:Ignorable="w14 w15 w16se w16cid w16 w16cex w16sdtdh w16sdtfl w16du wp14">
   <w:abstractNum w:abstractNumId="0" w15:restartNumberingAfterBreak="0">
+    <w:nsid w:val="1A062004"/>
+    <w:multiLevelType w:val="multilevel"/>
+    <w:tmpl w:val="F72A97E8"/>
+    <w:lvl w:ilvl="0">
+      <w:start w:val="2"/>
+      <w:numFmt w:val="decimal"/>
+      <w:lvlText w:val="%1"/>
+      <w:lvlJc w:val="left"/>
+      <w:pPr>
+        <w:ind w:left="360" w:hanging="360"/>
+      </w:pPr>
+      <w:rPr>
+        <w:rFonts w:hint="default"/>
+      </w:rPr>
+    </w:lvl>
+    <w:lvl w:ilvl="1">
+      <w:start w:val="6"/>
+      <w:numFmt w:val="decimal"/>
+      <w:lvlText w:val="%1.%2"/>
+      <w:lvlJc w:val="left"/>
+      <w:pPr>
+        <w:ind w:left="360" w:hanging="360"/>
+      </w:pPr>
+      <w:rPr>
+        <w:rFonts w:hint="default"/>
+      </w:rPr>
+    </w:lvl>
+    <w:lvl w:ilvl="2">
+      <w:start w:val="1"/>
+      <w:numFmt w:val="decimal"/>
+      <w:lvlText w:val="%1.%2.%3"/>
+      <w:lvlJc w:val="left"/>
+      <w:pPr>
+        <w:ind w:left="720" w:hanging="720"/>
+      </w:pPr>
+      <w:rPr>
+        <w:rFonts w:hint="default"/>
+      </w:rPr>
+    </w:lvl>
+    <w:lvl w:ilvl="3">
+      <w:start w:val="1"/>
+      <w:numFmt w:val="decimal"/>
+      <w:lvlText w:val="%1.%2.%3.%4"/>
+      <w:lvlJc w:val="left"/>
+      <w:pPr>
+        <w:ind w:left="1080" w:hanging="1080"/>
+      </w:pPr>
+      <w:rPr>
+        <w:rFonts w:hint="default"/>
+      </w:rPr>
+    </w:lvl>
+    <w:lvl w:ilvl="4">
+      <w:start w:val="1"/>
+      <w:numFmt w:val="decimal"/>
+      <w:lvlText w:val="%1.%2.%3.%4.%5"/>
+      <w:lvlJc w:val="left"/>
+      <w:pPr>
+        <w:ind w:left="1080" w:hanging="1080"/>
+      </w:pPr>
+      <w:rPr>
+        <w:rFonts w:hint="default"/>
+      </w:rPr>
+    </w:lvl>
+    <w:lvl w:ilvl="5">
+      <w:start w:val="1"/>
+      <w:numFmt w:val="decimal"/>
+      <w:lvlText w:val="%1.%2.%3.%4.%5.%6"/>
+      <w:lvlJc w:val="left"/>
+      <w:pPr>
+        <w:ind w:left="1440" w:hanging="1440"/>
+      </w:pPr>
+      <w:rPr>
+        <w:rFonts w:hint="default"/>
+      </w:rPr>
+    </w:lvl>
+    <w:lvl w:ilvl="6">
+      <w:start w:val="1"/>
+      <w:numFmt w:val="decimal"/>
+      <w:lvlText w:val="%1.%2.%3.%4.%5.%6.%7"/>
+      <w:lvlJc w:val="left"/>
+      <w:pPr>
+        <w:ind w:left="1440" w:hanging="1440"/>
+      </w:pPr>
+      <w:rPr>
+        <w:rFonts w:hint="default"/>
+      </w:rPr>
+    </w:lvl>
+    <w:lvl w:ilvl="7">
+      <w:start w:val="1"/>
+      <w:numFmt w:val="decimal"/>
+      <w:lvlText w:val="%1.%2.%3.%4.%5.%6.%7.%8"/>
+      <w:lvlJc w:val="left"/>
+      <w:pPr>
+        <w:ind w:left="1800" w:hanging="1800"/>
+      </w:pPr>
+      <w:rPr>
+        <w:rFonts w:hint="default"/>
+      </w:rPr>
+    </w:lvl>
+    <w:lvl w:ilvl="8">
+      <w:start w:val="1"/>
+      <w:numFmt w:val="decimal"/>
+      <w:lvlText w:val="%1.%2.%3.%4.%5.%6.%7.%8.%9"/>
+      <w:lvlJc w:val="left"/>
+      <w:pPr>
+        <w:ind w:left="1800" w:hanging="1800"/>
+      </w:pPr>
+      <w:rPr>
+        <w:rFonts w:hint="default"/>
+      </w:rPr>
+    </w:lvl>
+  </w:abstractNum>
+  <w:abstractNum w:abstractNumId="1" w15:restartNumberingAfterBreak="0">
     <w:nsid w:val="2124256D"/>
     <w:multiLevelType w:val="multilevel"/>
     <w:tmpl w:val="11BCD424"/>
@@ -1364,8 +2175,195 @@
       </w:rPr>
     </w:lvl>
   </w:abstractNum>
+  <w:abstractNum w:abstractNumId="2" w15:restartNumberingAfterBreak="0">
+    <w:nsid w:val="4EFF6061"/>
+    <w:multiLevelType w:val="hybridMultilevel"/>
+    <w:tmpl w:val="3EA239A0"/>
+    <w:lvl w:ilvl="0" w:tplc="CC6862C2">
+      <w:start w:val="3"/>
+      <w:numFmt w:val="decimal"/>
+      <w:lvlText w:val="%1"/>
+      <w:lvlJc w:val="left"/>
+      <w:pPr>
+        <w:ind w:left="720" w:hanging="360"/>
+      </w:pPr>
+      <w:rPr>
+        <w:rFonts w:hint="default"/>
+      </w:rPr>
+    </w:lvl>
+    <w:lvl w:ilvl="1" w:tplc="04160019" w:tentative="1">
+      <w:start w:val="1"/>
+      <w:numFmt w:val="lowerLetter"/>
+      <w:lvlText w:val="%2."/>
+      <w:lvlJc w:val="left"/>
+      <w:pPr>
+        <w:ind w:left="1440" w:hanging="360"/>
+      </w:pPr>
+    </w:lvl>
+    <w:lvl w:ilvl="2" w:tplc="0416001B" w:tentative="1">
+      <w:start w:val="1"/>
+      <w:numFmt w:val="lowerRoman"/>
+      <w:lvlText w:val="%3."/>
+      <w:lvlJc w:val="right"/>
+      <w:pPr>
+        <w:ind w:left="2160" w:hanging="180"/>
+      </w:pPr>
+    </w:lvl>
+    <w:lvl w:ilvl="3" w:tplc="0416000F" w:tentative="1">
+      <w:start w:val="1"/>
+      <w:numFmt w:val="decimal"/>
+      <w:lvlText w:val="%4."/>
+      <w:lvlJc w:val="left"/>
+      <w:pPr>
+        <w:ind w:left="2880" w:hanging="360"/>
+      </w:pPr>
+    </w:lvl>
+    <w:lvl w:ilvl="4" w:tplc="04160019" w:tentative="1">
+      <w:start w:val="1"/>
+      <w:numFmt w:val="lowerLetter"/>
+      <w:lvlText w:val="%5."/>
+      <w:lvlJc w:val="left"/>
+      <w:pPr>
+        <w:ind w:left="3600" w:hanging="360"/>
+      </w:pPr>
+    </w:lvl>
+    <w:lvl w:ilvl="5" w:tplc="0416001B" w:tentative="1">
+      <w:start w:val="1"/>
+      <w:numFmt w:val="lowerRoman"/>
+      <w:lvlText w:val="%6."/>
+      <w:lvlJc w:val="right"/>
+      <w:pPr>
+        <w:ind w:left="4320" w:hanging="180"/>
+      </w:pPr>
+    </w:lvl>
+    <w:lvl w:ilvl="6" w:tplc="0416000F" w:tentative="1">
+      <w:start w:val="1"/>
+      <w:numFmt w:val="decimal"/>
+      <w:lvlText w:val="%7."/>
+      <w:lvlJc w:val="left"/>
+      <w:pPr>
+        <w:ind w:left="5040" w:hanging="360"/>
+      </w:pPr>
+    </w:lvl>
+    <w:lvl w:ilvl="7" w:tplc="04160019" w:tentative="1">
+      <w:start w:val="1"/>
+      <w:numFmt w:val="lowerLetter"/>
+      <w:lvlText w:val="%8."/>
+      <w:lvlJc w:val="left"/>
+      <w:pPr>
+        <w:ind w:left="5760" w:hanging="360"/>
+      </w:pPr>
+    </w:lvl>
+    <w:lvl w:ilvl="8" w:tplc="0416001B" w:tentative="1">
+      <w:start w:val="1"/>
+      <w:numFmt w:val="lowerRoman"/>
+      <w:lvlText w:val="%9."/>
+      <w:lvlJc w:val="right"/>
+      <w:pPr>
+        <w:ind w:left="6480" w:hanging="180"/>
+      </w:pPr>
+    </w:lvl>
+  </w:abstractNum>
+  <w:abstractNum w:abstractNumId="3" w15:restartNumberingAfterBreak="0">
+    <w:nsid w:val="52F11BCB"/>
+    <w:multiLevelType w:val="hybridMultilevel"/>
+    <w:tmpl w:val="5DE20F9E"/>
+    <w:lvl w:ilvl="0" w:tplc="0416000F">
+      <w:start w:val="3"/>
+      <w:numFmt w:val="decimal"/>
+      <w:lvlText w:val="%1."/>
+      <w:lvlJc w:val="left"/>
+      <w:pPr>
+        <w:ind w:left="720" w:hanging="360"/>
+      </w:pPr>
+      <w:rPr>
+        <w:rFonts w:hint="default"/>
+      </w:rPr>
+    </w:lvl>
+    <w:lvl w:ilvl="1" w:tplc="04160019" w:tentative="1">
+      <w:start w:val="1"/>
+      <w:numFmt w:val="lowerLetter"/>
+      <w:lvlText w:val="%2."/>
+      <w:lvlJc w:val="left"/>
+      <w:pPr>
+        <w:ind w:left="1440" w:hanging="360"/>
+      </w:pPr>
+    </w:lvl>
+    <w:lvl w:ilvl="2" w:tplc="0416001B" w:tentative="1">
+      <w:start w:val="1"/>
+      <w:numFmt w:val="lowerRoman"/>
+      <w:lvlText w:val="%3."/>
+      <w:lvlJc w:val="right"/>
+      <w:pPr>
+        <w:ind w:left="2160" w:hanging="180"/>
+      </w:pPr>
+    </w:lvl>
+    <w:lvl w:ilvl="3" w:tplc="0416000F" w:tentative="1">
+      <w:start w:val="1"/>
+      <w:numFmt w:val="decimal"/>
+      <w:lvlText w:val="%4."/>
+      <w:lvlJc w:val="left"/>
+      <w:pPr>
+        <w:ind w:left="2880" w:hanging="360"/>
+      </w:pPr>
+    </w:lvl>
+    <w:lvl w:ilvl="4" w:tplc="04160019" w:tentative="1">
+      <w:start w:val="1"/>
+      <w:numFmt w:val="lowerLetter"/>
+      <w:lvlText w:val="%5."/>
+      <w:lvlJc w:val="left"/>
+      <w:pPr>
+        <w:ind w:left="3600" w:hanging="360"/>
+      </w:pPr>
+    </w:lvl>
+    <w:lvl w:ilvl="5" w:tplc="0416001B" w:tentative="1">
+      <w:start w:val="1"/>
+      <w:numFmt w:val="lowerRoman"/>
+      <w:lvlText w:val="%6."/>
+      <w:lvlJc w:val="right"/>
+      <w:pPr>
+        <w:ind w:left="4320" w:hanging="180"/>
+      </w:pPr>
+    </w:lvl>
+    <w:lvl w:ilvl="6" w:tplc="0416000F" w:tentative="1">
+      <w:start w:val="1"/>
+      <w:numFmt w:val="decimal"/>
+      <w:lvlText w:val="%7."/>
+      <w:lvlJc w:val="left"/>
+      <w:pPr>
+        <w:ind w:left="5040" w:hanging="360"/>
+      </w:pPr>
+    </w:lvl>
+    <w:lvl w:ilvl="7" w:tplc="04160019" w:tentative="1">
+      <w:start w:val="1"/>
+      <w:numFmt w:val="lowerLetter"/>
+      <w:lvlText w:val="%8."/>
+      <w:lvlJc w:val="left"/>
+      <w:pPr>
+        <w:ind w:left="5760" w:hanging="360"/>
+      </w:pPr>
+    </w:lvl>
+    <w:lvl w:ilvl="8" w:tplc="0416001B" w:tentative="1">
+      <w:start w:val="1"/>
+      <w:numFmt w:val="lowerRoman"/>
+      <w:lvlText w:val="%9."/>
+      <w:lvlJc w:val="right"/>
+      <w:pPr>
+        <w:ind w:left="6480" w:hanging="180"/>
+      </w:pPr>
+    </w:lvl>
+  </w:abstractNum>
   <w:num w:numId="1" w16cid:durableId="1281378744">
+    <w:abstractNumId w:val="1"/>
+  </w:num>
+  <w:num w:numId="2" w16cid:durableId="627399029">
+    <w:abstractNumId w:val="3"/>
+  </w:num>
+  <w:num w:numId="3" w16cid:durableId="90592435">
     <w:abstractNumId w:val="0"/>
+  </w:num>
+  <w:num w:numId="4" w16cid:durableId="1821847220">
+    <w:abstractNumId w:val="2"/>
   </w:num>
 </w:numbering>
 </file>

</xml_diff>